<commit_message>
Garment wash trials, CAPA workflow, web push and mobile app
- Finished-garment wash trials with before/after photos and grades; failures
  downgrade the decoration method verdict (engine applyTrials)
- CAPA: pure state machine, auto-open on rejected/retest, supplier 8D response,
  Fanatics accept/return, retest auto-link and auto-close on approval, overdue
  tracking; DB guard trigger limits supplier edits; bi.capas view
- PWA (manifest, icons, service worker with offline page), VAPID web push with
  per-device subscriptions under RLS, settings card; Capacitor wrapper in mobile/
- Tests: 17 unit tests; RLS tests for CAPA/trials/push; IT dossier v1.1

Co-Authored-By: Claude Opus 5.5 <noreply@anthropic.com>
Claude-Session: https://claude.ai/code/session_011UDpPGrdxuTkyrhyPqYYDf
</commit_message>
<xml_diff>
--- a/fanatics-qc/docs/Fanatics_QC_Lab_Technical_Security_Audit_Dossier.docx
+++ b/fanatics-qc/docs/Fanatics_QC_Lab_Technical_Security_Audit_Dossier.docx
@@ -340,7 +340,7 @@
                 <w:sz w:val="18"/>
                 <w:szCs w:val="18"/>
               </w:rPr>
-              <w:t xml:space="preserve">1.0 — October 2026</w:t>
+              <w:t xml:space="preserve">1.1 — October 2026</w:t>
             </w:r>
           </w:p>
         </w:tc>
@@ -1385,6 +1385,46 @@
       </w:r>
       <w:r>
         <w:t xml:space="preserve"> — the Technician/Administrator reviews the dossier, may override a method verdict with justification, and records the decision: Approved, Approved with concession, Retest, On hold or Rejected. The mill is notified.</w:t>
+      </w:r>
+    </w:p>
+    <w:p>
+      <w:pPr>
+        <w:pStyle w:val="ListParagraph"/>
+        <w:numPr>
+          <w:ilvl w:val="0"/>
+          <w:numId w:val="2"/>
+        </w:numPr>
+        <w:spacing w:after="60" w:line="264"/>
+      </w:pPr>
+      <w:r>
+        <w:rPr>
+          <w:b/>
+          <w:bCs/>
+        </w:rPr>
+        <w:t xml:space="preserve">Garment verification</w:t>
+      </w:r>
+      <w:r>
+        <w:t xml:space="preserve"> — a finished, decorated garment is washed (e.g. 25 cycles) and rated with before/after photos; a failure downgrades the decoration method.</w:t>
+      </w:r>
+    </w:p>
+    <w:p>
+      <w:pPr>
+        <w:pStyle w:val="ListParagraph"/>
+        <w:numPr>
+          <w:ilvl w:val="0"/>
+          <w:numId w:val="2"/>
+        </w:numPr>
+        <w:spacing w:after="60" w:line="264"/>
+      </w:pPr>
+      <w:r>
+        <w:rPr>
+          <w:b/>
+          <w:bCs/>
+        </w:rPr>
+        <w:t xml:space="preserve">Corrective action (CAPA)</w:t>
+      </w:r>
+      <w:r>
+        <w:t xml:space="preserve"> — rejected or retest lots open a CAPA automatically; the mill documents root cause and actions, Fanatics accepts or returns it, and an approved retest lot closes it.</w:t>
       </w:r>
     </w:p>
     <w:p>
@@ -4085,6 +4125,95 @@
           </w:p>
         </w:tc>
       </w:tr>
+      <w:tr>
+        <w:tc>
+          <w:tcPr>
+            <w:tcW w:type="dxa" w:w="1900"/>
+            <w:tcBorders>
+              <w:top w:val="single" w:color="D9DCE3" w:sz="4"/>
+              <w:left w:val="single" w:color="D9DCE3" w:sz="4"/>
+              <w:bottom w:val="single" w:color="D9DCE3" w:sz="4"/>
+              <w:right w:val="single" w:color="D9DCE3" w:sz="4"/>
+            </w:tcBorders>
+            <w:tcMar>
+              <w:top w:type="dxa" w:w="60"/>
+              <w:left w:type="dxa" w:w="100"/>
+              <w:bottom w:type="dxa" w:w="60"/>
+              <w:right w:type="dxa" w:w="100"/>
+            </w:tcMar>
+          </w:tcPr>
+          <w:p>
+            <w:pPr>
+              <w:spacing w:after="20"/>
+            </w:pPr>
+            <w:r>
+              <w:rPr>
+                <w:sz w:val="18"/>
+                <w:szCs w:val="18"/>
+              </w:rPr>
+              <w:t xml:space="preserve">Mobile &amp; push</w:t>
+            </w:r>
+          </w:p>
+        </w:tc>
+        <w:tc>
+          <w:tcPr>
+            <w:tcW w:type="dxa" w:w="3000"/>
+            <w:tcBorders>
+              <w:top w:val="single" w:color="D9DCE3" w:sz="4"/>
+              <w:left w:val="single" w:color="D9DCE3" w:sz="4"/>
+              <w:bottom w:val="single" w:color="D9DCE3" w:sz="4"/>
+              <w:right w:val="single" w:color="D9DCE3" w:sz="4"/>
+            </w:tcBorders>
+            <w:tcMar>
+              <w:top w:type="dxa" w:w="60"/>
+              <w:left w:type="dxa" w:w="100"/>
+              <w:bottom w:type="dxa" w:w="60"/>
+              <w:right w:type="dxa" w:w="100"/>
+            </w:tcMar>
+          </w:tcPr>
+          <w:p>
+            <w:pPr>
+              <w:spacing w:after="20"/>
+            </w:pPr>
+            <w:r>
+              <w:rPr>
+                <w:sz w:val="18"/>
+                <w:szCs w:val="18"/>
+              </w:rPr>
+              <w:t xml:space="preserve">PWA (manifest, service worker), Web Push (VAPID), Capacitor</w:t>
+            </w:r>
+          </w:p>
+        </w:tc>
+        <w:tc>
+          <w:tcPr>
+            <w:tcW w:type="dxa" w:w="4460"/>
+            <w:tcBorders>
+              <w:top w:val="single" w:color="D9DCE3" w:sz="4"/>
+              <w:left w:val="single" w:color="D9DCE3" w:sz="4"/>
+              <w:bottom w:val="single" w:color="D9DCE3" w:sz="4"/>
+              <w:right w:val="single" w:color="D9DCE3" w:sz="4"/>
+            </w:tcBorders>
+            <w:tcMar>
+              <w:top w:type="dxa" w:w="60"/>
+              <w:left w:type="dxa" w:w="100"/>
+              <w:bottom w:type="dxa" w:w="60"/>
+              <w:right w:type="dxa" w:w="100"/>
+            </w:tcMar>
+          </w:tcPr>
+          <w:p>
+            <w:pPr>
+              <w:spacing w:after="20"/>
+            </w:pPr>
+            <w:r>
+              <w:rPr>
+                <w:sz w:val="18"/>
+                <w:szCs w:val="18"/>
+              </w:rPr>
+              <w:t xml:space="preserve">Installable app, offline page, push notifications for submissions, decisions and CAPA.</w:t>
+            </w:r>
+          </w:p>
+        </w:tc>
+      </w:tr>
     </w:tbl>
     <w:p>
       <w:pPr>
@@ -5225,6 +5354,153 @@
                 <w:sz w:val="18"/>
                 <w:szCs w:val="18"/>
               </w:rPr>
+              <w:t xml:space="preserve">Browser push services</w:t>
+            </w:r>
+          </w:p>
+        </w:tc>
+        <w:tc>
+          <w:tcPr>
+            <w:tcW w:type="dxa" w:w="1700"/>
+            <w:tcBorders>
+              <w:top w:val="single" w:color="D9DCE3" w:sz="4"/>
+              <w:left w:val="single" w:color="D9DCE3" w:sz="4"/>
+              <w:bottom w:val="single" w:color="D9DCE3" w:sz="4"/>
+              <w:right w:val="single" w:color="D9DCE3" w:sz="4"/>
+            </w:tcBorders>
+            <w:tcMar>
+              <w:top w:type="dxa" w:w="60"/>
+              <w:left w:type="dxa" w:w="100"/>
+              <w:bottom w:type="dxa" w:w="60"/>
+              <w:right w:type="dxa" w:w="100"/>
+            </w:tcMar>
+          </w:tcPr>
+          <w:p>
+            <w:pPr>
+              <w:spacing w:after="20"/>
+            </w:pPr>
+            <w:r>
+              <w:rPr>
+                <w:sz w:val="18"/>
+                <w:szCs w:val="18"/>
+              </w:rPr>
+              <w:t xml:space="preserve">Delivery of web push (Google FCM, Apple, Mozilla, Microsoft)</w:t>
+            </w:r>
+          </w:p>
+        </w:tc>
+        <w:tc>
+          <w:tcPr>
+            <w:tcW w:type="dxa" w:w="2200"/>
+            <w:tcBorders>
+              <w:top w:val="single" w:color="D9DCE3" w:sz="4"/>
+              <w:left w:val="single" w:color="D9DCE3" w:sz="4"/>
+              <w:bottom w:val="single" w:color="D9DCE3" w:sz="4"/>
+              <w:right w:val="single" w:color="D9DCE3" w:sz="4"/>
+            </w:tcBorders>
+            <w:tcMar>
+              <w:top w:type="dxa" w:w="60"/>
+              <w:left w:type="dxa" w:w="100"/>
+              <w:bottom w:type="dxa" w:w="60"/>
+              <w:right w:type="dxa" w:w="100"/>
+            </w:tcMar>
+          </w:tcPr>
+          <w:p>
+            <w:pPr>
+              <w:spacing w:after="20"/>
+            </w:pPr>
+            <w:r>
+              <w:rPr>
+                <w:sz w:val="18"/>
+                <w:szCs w:val="18"/>
+              </w:rPr>
+              <w:t xml:space="preserve">Encrypted push payload (title, short text, link) in transit only</w:t>
+            </w:r>
+          </w:p>
+        </w:tc>
+        <w:tc>
+          <w:tcPr>
+            <w:tcW w:type="dxa" w:w="2460"/>
+            <w:tcBorders>
+              <w:top w:val="single" w:color="D9DCE3" w:sz="4"/>
+              <w:left w:val="single" w:color="D9DCE3" w:sz="4"/>
+              <w:bottom w:val="single" w:color="D9DCE3" w:sz="4"/>
+              <w:right w:val="single" w:color="D9DCE3" w:sz="4"/>
+            </w:tcBorders>
+            <w:tcMar>
+              <w:top w:type="dxa" w:w="60"/>
+              <w:left w:type="dxa" w:w="100"/>
+              <w:bottom w:type="dxa" w:w="60"/>
+              <w:right w:type="dxa" w:w="100"/>
+            </w:tcMar>
+          </w:tcPr>
+          <w:p>
+            <w:pPr>
+              <w:spacing w:after="20"/>
+            </w:pPr>
+            <w:r>
+              <w:rPr>
+                <w:sz w:val="18"/>
+                <w:szCs w:val="18"/>
+              </w:rPr>
+              <w:t xml:space="preserve">Payload end-to-end encrypted per RFC 8291</w:t>
+            </w:r>
+          </w:p>
+        </w:tc>
+        <w:tc>
+          <w:tcPr>
+            <w:tcW w:type="dxa" w:w="1800"/>
+            <w:tcBorders>
+              <w:top w:val="single" w:color="D9DCE3" w:sz="4"/>
+              <w:left w:val="single" w:color="D9DCE3" w:sz="4"/>
+              <w:bottom w:val="single" w:color="D9DCE3" w:sz="4"/>
+              <w:right w:val="single" w:color="D9DCE3" w:sz="4"/>
+            </w:tcBorders>
+            <w:tcMar>
+              <w:top w:type="dxa" w:w="60"/>
+              <w:left w:type="dxa" w:w="100"/>
+              <w:bottom w:type="dxa" w:w="60"/>
+              <w:right w:type="dxa" w:w="100"/>
+            </w:tcMar>
+          </w:tcPr>
+          <w:p>
+            <w:pPr>
+              <w:spacing w:after="20"/>
+            </w:pPr>
+            <w:r>
+              <w:rPr>
+                <w:sz w:val="18"/>
+                <w:szCs w:val="18"/>
+              </w:rPr>
+              <w:t xml:space="preserve">No account needed</w:t>
+            </w:r>
+          </w:p>
+        </w:tc>
+      </w:tr>
+      <w:tr>
+        <w:tc>
+          <w:tcPr>
+            <w:tcW w:type="dxa" w:w="1200"/>
+            <w:tcBorders>
+              <w:top w:val="single" w:color="D9DCE3" w:sz="4"/>
+              <w:left w:val="single" w:color="D9DCE3" w:sz="4"/>
+              <w:bottom w:val="single" w:color="D9DCE3" w:sz="4"/>
+              <w:right w:val="single" w:color="D9DCE3" w:sz="4"/>
+            </w:tcBorders>
+            <w:tcMar>
+              <w:top w:type="dxa" w:w="60"/>
+              <w:left w:type="dxa" w:w="100"/>
+              <w:bottom w:type="dxa" w:w="60"/>
+              <w:right w:type="dxa" w:w="100"/>
+            </w:tcMar>
+          </w:tcPr>
+          <w:p>
+            <w:pPr>
+              <w:spacing w:after="20"/>
+            </w:pPr>
+            <w:r>
+              <w:rPr>
+                <w:sz w:val="18"/>
+                <w:szCs w:val="18"/>
+              </w:rPr>
               <w:t xml:space="preserve">Resend</w:t>
             </w:r>
           </w:p>
@@ -6432,6 +6708,273 @@
                 <w:sz w:val="18"/>
                 <w:szCs w:val="18"/>
               </w:rPr>
+              <w:t xml:space="preserve">garment_trials</w:t>
+            </w:r>
+          </w:p>
+        </w:tc>
+        <w:tc>
+          <w:tcPr>
+            <w:tcW w:type="dxa" w:w="4860"/>
+            <w:tcBorders>
+              <w:top w:val="single" w:color="D9DCE3" w:sz="4"/>
+              <w:left w:val="single" w:color="D9DCE3" w:sz="4"/>
+              <w:bottom w:val="single" w:color="D9DCE3" w:sz="4"/>
+              <w:right w:val="single" w:color="D9DCE3" w:sz="4"/>
+            </w:tcBorders>
+            <w:tcMar>
+              <w:top w:type="dxa" w:w="60"/>
+              <w:left w:type="dxa" w:w="100"/>
+              <w:bottom w:type="dxa" w:w="60"/>
+              <w:right w:type="dxa" w:w="100"/>
+            </w:tcMar>
+          </w:tcPr>
+          <w:p>
+            <w:pPr>
+              <w:spacing w:after="20"/>
+            </w:pPr>
+            <w:r>
+              <w:rPr>
+                <w:sz w:val="18"/>
+                <w:szCs w:val="18"/>
+              </w:rPr>
+              <w:t xml:space="preserve">Finished-garment wash trials: method, placement, cycles, grades, before/after photo links</w:t>
+            </w:r>
+          </w:p>
+        </w:tc>
+        <w:tc>
+          <w:tcPr>
+            <w:tcW w:type="dxa" w:w="2000"/>
+            <w:tcBorders>
+              <w:top w:val="single" w:color="D9DCE3" w:sz="4"/>
+              <w:left w:val="single" w:color="D9DCE3" w:sz="4"/>
+              <w:bottom w:val="single" w:color="D9DCE3" w:sz="4"/>
+              <w:right w:val="single" w:color="D9DCE3" w:sz="4"/>
+            </w:tcBorders>
+            <w:tcMar>
+              <w:top w:type="dxa" w:w="60"/>
+              <w:left w:type="dxa" w:w="100"/>
+              <w:bottom w:type="dxa" w:w="60"/>
+              <w:right w:type="dxa" w:w="100"/>
+            </w:tcMar>
+          </w:tcPr>
+          <w:p>
+            <w:pPr>
+              <w:spacing w:after="20"/>
+            </w:pPr>
+            <w:r>
+              <w:rPr>
+                <w:sz w:val="18"/>
+                <w:szCs w:val="18"/>
+              </w:rPr>
+              <w:t xml:space="preserve">Internal — supplier confidential</w:t>
+            </w:r>
+          </w:p>
+        </w:tc>
+      </w:tr>
+      <w:tr>
+        <w:tc>
+          <w:tcPr>
+            <w:tcW w:type="dxa" w:w="2500"/>
+            <w:tcBorders>
+              <w:top w:val="single" w:color="D9DCE3" w:sz="4"/>
+              <w:left w:val="single" w:color="D9DCE3" w:sz="4"/>
+              <w:bottom w:val="single" w:color="D9DCE3" w:sz="4"/>
+              <w:right w:val="single" w:color="D9DCE3" w:sz="4"/>
+            </w:tcBorders>
+            <w:tcMar>
+              <w:top w:type="dxa" w:w="60"/>
+              <w:left w:type="dxa" w:w="100"/>
+              <w:bottom w:type="dxa" w:w="60"/>
+              <w:right w:type="dxa" w:w="100"/>
+            </w:tcMar>
+          </w:tcPr>
+          <w:p>
+            <w:pPr>
+              <w:spacing w:after="20"/>
+            </w:pPr>
+            <w:r>
+              <w:rPr>
+                <w:sz w:val="18"/>
+                <w:szCs w:val="18"/>
+              </w:rPr>
+              <w:t xml:space="preserve">capas</w:t>
+            </w:r>
+          </w:p>
+        </w:tc>
+        <w:tc>
+          <w:tcPr>
+            <w:tcW w:type="dxa" w:w="4860"/>
+            <w:tcBorders>
+              <w:top w:val="single" w:color="D9DCE3" w:sz="4"/>
+              <w:left w:val="single" w:color="D9DCE3" w:sz="4"/>
+              <w:bottom w:val="single" w:color="D9DCE3" w:sz="4"/>
+              <w:right w:val="single" w:color="D9DCE3" w:sz="4"/>
+            </w:tcBorders>
+            <w:tcMar>
+              <w:top w:type="dxa" w:w="60"/>
+              <w:left w:type="dxa" w:w="100"/>
+              <w:bottom w:type="dxa" w:w="60"/>
+              <w:right w:type="dxa" w:w="100"/>
+            </w:tcMar>
+          </w:tcPr>
+          <w:p>
+            <w:pPr>
+              <w:spacing w:after="20"/>
+            </w:pPr>
+            <w:r>
+              <w:rPr>
+                <w:sz w:val="18"/>
+                <w:szCs w:val="18"/>
+              </w:rPr>
+              <w:t xml:space="preserve">Corrective &amp; preventive actions: problem, root cause, containment, actions, due date, review</w:t>
+            </w:r>
+          </w:p>
+        </w:tc>
+        <w:tc>
+          <w:tcPr>
+            <w:tcW w:type="dxa" w:w="2000"/>
+            <w:tcBorders>
+              <w:top w:val="single" w:color="D9DCE3" w:sz="4"/>
+              <w:left w:val="single" w:color="D9DCE3" w:sz="4"/>
+              <w:bottom w:val="single" w:color="D9DCE3" w:sz="4"/>
+              <w:right w:val="single" w:color="D9DCE3" w:sz="4"/>
+            </w:tcBorders>
+            <w:tcMar>
+              <w:top w:type="dxa" w:w="60"/>
+              <w:left w:type="dxa" w:w="100"/>
+              <w:bottom w:type="dxa" w:w="60"/>
+              <w:right w:type="dxa" w:w="100"/>
+            </w:tcMar>
+          </w:tcPr>
+          <w:p>
+            <w:pPr>
+              <w:spacing w:after="20"/>
+            </w:pPr>
+            <w:r>
+              <w:rPr>
+                <w:sz w:val="18"/>
+                <w:szCs w:val="18"/>
+              </w:rPr>
+              <w:t xml:space="preserve">Internal — supplier confidential</w:t>
+            </w:r>
+          </w:p>
+        </w:tc>
+      </w:tr>
+      <w:tr>
+        <w:tc>
+          <w:tcPr>
+            <w:tcW w:type="dxa" w:w="2500"/>
+            <w:tcBorders>
+              <w:top w:val="single" w:color="D9DCE3" w:sz="4"/>
+              <w:left w:val="single" w:color="D9DCE3" w:sz="4"/>
+              <w:bottom w:val="single" w:color="D9DCE3" w:sz="4"/>
+              <w:right w:val="single" w:color="D9DCE3" w:sz="4"/>
+            </w:tcBorders>
+            <w:tcMar>
+              <w:top w:type="dxa" w:w="60"/>
+              <w:left w:type="dxa" w:w="100"/>
+              <w:bottom w:type="dxa" w:w="60"/>
+              <w:right w:type="dxa" w:w="100"/>
+            </w:tcMar>
+          </w:tcPr>
+          <w:p>
+            <w:pPr>
+              <w:spacing w:after="20"/>
+            </w:pPr>
+            <w:r>
+              <w:rPr>
+                <w:sz w:val="18"/>
+                <w:szCs w:val="18"/>
+              </w:rPr>
+              <w:t xml:space="preserve">push_subscriptions</w:t>
+            </w:r>
+          </w:p>
+        </w:tc>
+        <w:tc>
+          <w:tcPr>
+            <w:tcW w:type="dxa" w:w="4860"/>
+            <w:tcBorders>
+              <w:top w:val="single" w:color="D9DCE3" w:sz="4"/>
+              <w:left w:val="single" w:color="D9DCE3" w:sz="4"/>
+              <w:bottom w:val="single" w:color="D9DCE3" w:sz="4"/>
+              <w:right w:val="single" w:color="D9DCE3" w:sz="4"/>
+            </w:tcBorders>
+            <w:tcMar>
+              <w:top w:type="dxa" w:w="60"/>
+              <w:left w:type="dxa" w:w="100"/>
+              <w:bottom w:type="dxa" w:w="60"/>
+              <w:right w:type="dxa" w:w="100"/>
+            </w:tcMar>
+          </w:tcPr>
+          <w:p>
+            <w:pPr>
+              <w:spacing w:after="20"/>
+            </w:pPr>
+            <w:r>
+              <w:rPr>
+                <w:sz w:val="18"/>
+                <w:szCs w:val="18"/>
+              </w:rPr>
+              <w:t xml:space="preserve">Browser push endpoint and public keys per user device (no message content)</w:t>
+            </w:r>
+          </w:p>
+        </w:tc>
+        <w:tc>
+          <w:tcPr>
+            <w:tcW w:type="dxa" w:w="2000"/>
+            <w:tcBorders>
+              <w:top w:val="single" w:color="D9DCE3" w:sz="4"/>
+              <w:left w:val="single" w:color="D9DCE3" w:sz="4"/>
+              <w:bottom w:val="single" w:color="D9DCE3" w:sz="4"/>
+              <w:right w:val="single" w:color="D9DCE3" w:sz="4"/>
+            </w:tcBorders>
+            <w:tcMar>
+              <w:top w:type="dxa" w:w="60"/>
+              <w:left w:type="dxa" w:w="100"/>
+              <w:bottom w:type="dxa" w:w="60"/>
+              <w:right w:type="dxa" w:w="100"/>
+            </w:tcMar>
+          </w:tcPr>
+          <w:p>
+            <w:pPr>
+              <w:spacing w:after="20"/>
+            </w:pPr>
+            <w:r>
+              <w:rPr>
+                <w:sz w:val="18"/>
+                <w:szCs w:val="18"/>
+              </w:rPr>
+              <w:t xml:space="preserve">Internal</w:t>
+            </w:r>
+          </w:p>
+        </w:tc>
+      </w:tr>
+      <w:tr>
+        <w:tc>
+          <w:tcPr>
+            <w:tcW w:type="dxa" w:w="2500"/>
+            <w:tcBorders>
+              <w:top w:val="single" w:color="D9DCE3" w:sz="4"/>
+              <w:left w:val="single" w:color="D9DCE3" w:sz="4"/>
+              <w:bottom w:val="single" w:color="D9DCE3" w:sz="4"/>
+              <w:right w:val="single" w:color="D9DCE3" w:sz="4"/>
+            </w:tcBorders>
+            <w:tcMar>
+              <w:top w:type="dxa" w:w="60"/>
+              <w:left w:type="dxa" w:w="100"/>
+              <w:bottom w:type="dxa" w:w="60"/>
+              <w:right w:type="dxa" w:w="100"/>
+            </w:tcMar>
+          </w:tcPr>
+          <w:p>
+            <w:pPr>
+              <w:spacing w:after="20"/>
+            </w:pPr>
+            <w:r>
+              <w:rPr>
+                <w:sz w:val="18"/>
+                <w:szCs w:val="18"/>
+              </w:rPr>
               <w:t xml:space="preserve">api_keys</w:t>
             </w:r>
           </w:p>
@@ -10088,6 +10631,560 @@
     </w:p>
     <w:p>
       <w:pPr>
+        <w:pStyle w:val="Heading2"/>
+      </w:pPr>
+      <w:r>
+        <w:t xml:space="preserve">8.3 Finished-garment wash trial</w:t>
+      </w:r>
+    </w:p>
+    <w:p>
+      <w:pPr>
+        <w:spacing w:after="120" w:line="276"/>
+      </w:pPr>
+      <w:r>
+        <w:t xml:space="preserve">Minimums: overall appearance, cracking and peeling ≥ 4; fading ≥ 3.5; shrinkage ≤ 5 %. One minor miss → the method becomes </w:t>
+      </w:r>
+      <w:r>
+        <w:rPr>
+          <w:b/>
+          <w:bCs/>
+        </w:rPr>
+        <w:t xml:space="preserve">conditional (concession)</w:t>
+      </w:r>
+      <w:r>
+        <w:t xml:space="preserve">; a severe result (≤ 2.5) or several misses → the method is </w:t>
+      </w:r>
+      <w:r>
+        <w:rPr>
+          <w:b/>
+          <w:bCs/>
+        </w:rPr>
+        <w:t xml:space="preserve">not approved</w:t>
+      </w:r>
+      <w:r>
+        <w:t xml:space="preserve"> for that lot (unless staff override with justification). Before and after photos are stored as evidence with SHA-256 fingerprints.</w:t>
+      </w:r>
+    </w:p>
+    <w:p>
+      <w:pPr>
+        <w:pStyle w:val="Heading2"/>
+      </w:pPr>
+      <w:r>
+        <w:t xml:space="preserve">8.4 CAPA workflow</w:t>
+      </w:r>
+    </w:p>
+    <w:tbl>
+      <w:tblPr>
+        <w:tblW w:type="dxa" w:w="9360"/>
+        <w:tblBorders>
+          <w:top w:val="single" w:color="auto" w:sz="4"/>
+          <w:left w:val="single" w:color="auto" w:sz="4"/>
+          <w:bottom w:val="single" w:color="auto" w:sz="4"/>
+          <w:right w:val="single" w:color="auto" w:sz="4"/>
+          <w:insideH w:val="single" w:color="auto" w:sz="4"/>
+          <w:insideV w:val="single" w:color="auto" w:sz="4"/>
+        </w:tblBorders>
+      </w:tblPr>
+      <w:tblGrid>
+        <w:gridCol w:w="1600"/>
+        <w:gridCol w:w="2800"/>
+        <w:gridCol w:w="4960"/>
+      </w:tblGrid>
+      <w:tr>
+        <w:trPr>
+          <w:tblHeader/>
+        </w:trPr>
+        <w:tc>
+          <w:tcPr>
+            <w:tcW w:type="dxa" w:w="1600"/>
+            <w:tcBorders>
+              <w:top w:val="single" w:color="D9DCE3" w:sz="4"/>
+              <w:left w:val="single" w:color="D9DCE3" w:sz="4"/>
+              <w:bottom w:val="single" w:color="D9DCE3" w:sz="4"/>
+              <w:right w:val="single" w:color="D9DCE3" w:sz="4"/>
+            </w:tcBorders>
+            <w:shd w:fill="09203F" w:color="auto" w:val="clear"/>
+            <w:tcMar>
+              <w:top w:type="dxa" w:w="60"/>
+              <w:left w:type="dxa" w:w="100"/>
+              <w:bottom w:type="dxa" w:w="60"/>
+              <w:right w:type="dxa" w:w="100"/>
+            </w:tcMar>
+          </w:tcPr>
+          <w:p>
+            <w:pPr>
+              <w:spacing w:after="20"/>
+            </w:pPr>
+            <w:r>
+              <w:rPr>
+                <w:b/>
+                <w:bCs/>
+                <w:color w:val="FFFFFF"/>
+                <w:sz w:val="18"/>
+                <w:szCs w:val="18"/>
+              </w:rPr>
+              <w:t xml:space="preserve">Step</w:t>
+            </w:r>
+          </w:p>
+        </w:tc>
+        <w:tc>
+          <w:tcPr>
+            <w:tcW w:type="dxa" w:w="2800"/>
+            <w:tcBorders>
+              <w:top w:val="single" w:color="D9DCE3" w:sz="4"/>
+              <w:left w:val="single" w:color="D9DCE3" w:sz="4"/>
+              <w:bottom w:val="single" w:color="D9DCE3" w:sz="4"/>
+              <w:right w:val="single" w:color="D9DCE3" w:sz="4"/>
+            </w:tcBorders>
+            <w:shd w:fill="09203F" w:color="auto" w:val="clear"/>
+            <w:tcMar>
+              <w:top w:type="dxa" w:w="60"/>
+              <w:left w:type="dxa" w:w="100"/>
+              <w:bottom w:type="dxa" w:w="60"/>
+              <w:right w:type="dxa" w:w="100"/>
+            </w:tcMar>
+          </w:tcPr>
+          <w:p>
+            <w:pPr>
+              <w:spacing w:after="20"/>
+            </w:pPr>
+            <w:r>
+              <w:rPr>
+                <w:b/>
+                <w:bCs/>
+                <w:color w:val="FFFFFF"/>
+                <w:sz w:val="18"/>
+                <w:szCs w:val="18"/>
+              </w:rPr>
+              <w:t xml:space="preserve">Who</w:t>
+            </w:r>
+          </w:p>
+        </w:tc>
+        <w:tc>
+          <w:tcPr>
+            <w:tcW w:type="dxa" w:w="4960"/>
+            <w:tcBorders>
+              <w:top w:val="single" w:color="D9DCE3" w:sz="4"/>
+              <w:left w:val="single" w:color="D9DCE3" w:sz="4"/>
+              <w:bottom w:val="single" w:color="D9DCE3" w:sz="4"/>
+              <w:right w:val="single" w:color="D9DCE3" w:sz="4"/>
+            </w:tcBorders>
+            <w:shd w:fill="09203F" w:color="auto" w:val="clear"/>
+            <w:tcMar>
+              <w:top w:type="dxa" w:w="60"/>
+              <w:left w:type="dxa" w:w="100"/>
+              <w:bottom w:type="dxa" w:w="60"/>
+              <w:right w:type="dxa" w:w="100"/>
+            </w:tcMar>
+          </w:tcPr>
+          <w:p>
+            <w:pPr>
+              <w:spacing w:after="20"/>
+            </w:pPr>
+            <w:r>
+              <w:rPr>
+                <w:b/>
+                <w:bCs/>
+                <w:color w:val="FFFFFF"/>
+                <w:sz w:val="18"/>
+                <w:szCs w:val="18"/>
+              </w:rPr>
+              <w:t xml:space="preserve">System behaviour</w:t>
+            </w:r>
+          </w:p>
+        </w:tc>
+      </w:tr>
+      <w:tr>
+        <w:tc>
+          <w:tcPr>
+            <w:tcW w:type="dxa" w:w="1600"/>
+            <w:tcBorders>
+              <w:top w:val="single" w:color="D9DCE3" w:sz="4"/>
+              <w:left w:val="single" w:color="D9DCE3" w:sz="4"/>
+              <w:bottom w:val="single" w:color="D9DCE3" w:sz="4"/>
+              <w:right w:val="single" w:color="D9DCE3" w:sz="4"/>
+            </w:tcBorders>
+            <w:tcMar>
+              <w:top w:type="dxa" w:w="60"/>
+              <w:left w:type="dxa" w:w="100"/>
+              <w:bottom w:type="dxa" w:w="60"/>
+              <w:right w:type="dxa" w:w="100"/>
+            </w:tcMar>
+          </w:tcPr>
+          <w:p>
+            <w:pPr>
+              <w:spacing w:after="20"/>
+            </w:pPr>
+            <w:r>
+              <w:rPr>
+                <w:sz w:val="18"/>
+                <w:szCs w:val="18"/>
+              </w:rPr>
+              <w:t xml:space="preserve">Open</w:t>
+            </w:r>
+          </w:p>
+        </w:tc>
+        <w:tc>
+          <w:tcPr>
+            <w:tcW w:type="dxa" w:w="2800"/>
+            <w:tcBorders>
+              <w:top w:val="single" w:color="D9DCE3" w:sz="4"/>
+              <w:left w:val="single" w:color="D9DCE3" w:sz="4"/>
+              <w:bottom w:val="single" w:color="D9DCE3" w:sz="4"/>
+              <w:right w:val="single" w:color="D9DCE3" w:sz="4"/>
+            </w:tcBorders>
+            <w:tcMar>
+              <w:top w:type="dxa" w:w="60"/>
+              <w:left w:type="dxa" w:w="100"/>
+              <w:bottom w:type="dxa" w:w="60"/>
+              <w:right w:type="dxa" w:w="100"/>
+            </w:tcMar>
+          </w:tcPr>
+          <w:p>
+            <w:pPr>
+              <w:spacing w:after="20"/>
+            </w:pPr>
+            <w:r>
+              <w:rPr>
+                <w:sz w:val="18"/>
+                <w:szCs w:val="18"/>
+              </w:rPr>
+              <w:t xml:space="preserve">Automatic on Rejected / Retest (or staff)</w:t>
+            </w:r>
+          </w:p>
+        </w:tc>
+        <w:tc>
+          <w:tcPr>
+            <w:tcW w:type="dxa" w:w="4960"/>
+            <w:tcBorders>
+              <w:top w:val="single" w:color="D9DCE3" w:sz="4"/>
+              <w:left w:val="single" w:color="D9DCE3" w:sz="4"/>
+              <w:bottom w:val="single" w:color="D9DCE3" w:sz="4"/>
+              <w:right w:val="single" w:color="D9DCE3" w:sz="4"/>
+            </w:tcBorders>
+            <w:tcMar>
+              <w:top w:type="dxa" w:w="60"/>
+              <w:left w:type="dxa" w:w="100"/>
+              <w:bottom w:type="dxa" w:w="60"/>
+              <w:right w:type="dxa" w:w="100"/>
+            </w:tcMar>
+          </w:tcPr>
+          <w:p>
+            <w:pPr>
+              <w:spacing w:after="20"/>
+            </w:pPr>
+            <w:r>
+              <w:rPr>
+                <w:sz w:val="18"/>
+                <w:szCs w:val="18"/>
+              </w:rPr>
+              <w:t xml:space="preserve">Problem statement generated from failing tests; due date +14 days; mill notified</w:t>
+            </w:r>
+          </w:p>
+        </w:tc>
+      </w:tr>
+      <w:tr>
+        <w:tc>
+          <w:tcPr>
+            <w:tcW w:type="dxa" w:w="1600"/>
+            <w:tcBorders>
+              <w:top w:val="single" w:color="D9DCE3" w:sz="4"/>
+              <w:left w:val="single" w:color="D9DCE3" w:sz="4"/>
+              <w:bottom w:val="single" w:color="D9DCE3" w:sz="4"/>
+              <w:right w:val="single" w:color="D9DCE3" w:sz="4"/>
+            </w:tcBorders>
+            <w:tcMar>
+              <w:top w:type="dxa" w:w="60"/>
+              <w:left w:type="dxa" w:w="100"/>
+              <w:bottom w:type="dxa" w:w="60"/>
+              <w:right w:type="dxa" w:w="100"/>
+            </w:tcMar>
+          </w:tcPr>
+          <w:p>
+            <w:pPr>
+              <w:spacing w:after="20"/>
+            </w:pPr>
+            <w:r>
+              <w:rPr>
+                <w:sz w:val="18"/>
+                <w:szCs w:val="18"/>
+              </w:rPr>
+              <w:t xml:space="preserve">Respond</w:t>
+            </w:r>
+          </w:p>
+        </w:tc>
+        <w:tc>
+          <w:tcPr>
+            <w:tcW w:type="dxa" w:w="2800"/>
+            <w:tcBorders>
+              <w:top w:val="single" w:color="D9DCE3" w:sz="4"/>
+              <w:left w:val="single" w:color="D9DCE3" w:sz="4"/>
+              <w:bottom w:val="single" w:color="D9DCE3" w:sz="4"/>
+              <w:right w:val="single" w:color="D9DCE3" w:sz="4"/>
+            </w:tcBorders>
+            <w:tcMar>
+              <w:top w:type="dxa" w:w="60"/>
+              <w:left w:type="dxa" w:w="100"/>
+              <w:bottom w:type="dxa" w:w="60"/>
+              <w:right w:type="dxa" w:w="100"/>
+            </w:tcMar>
+          </w:tcPr>
+          <w:p>
+            <w:pPr>
+              <w:spacing w:after="20"/>
+            </w:pPr>
+            <w:r>
+              <w:rPr>
+                <w:sz w:val="18"/>
+                <w:szCs w:val="18"/>
+              </w:rPr>
+              <w:t xml:space="preserve">Mill</w:t>
+            </w:r>
+          </w:p>
+        </w:tc>
+        <w:tc>
+          <w:tcPr>
+            <w:tcW w:type="dxa" w:w="4960"/>
+            <w:tcBorders>
+              <w:top w:val="single" w:color="D9DCE3" w:sz="4"/>
+              <w:left w:val="single" w:color="D9DCE3" w:sz="4"/>
+              <w:bottom w:val="single" w:color="D9DCE3" w:sz="4"/>
+              <w:right w:val="single" w:color="D9DCE3" w:sz="4"/>
+            </w:tcBorders>
+            <w:tcMar>
+              <w:top w:type="dxa" w:w="60"/>
+              <w:left w:type="dxa" w:w="100"/>
+              <w:bottom w:type="dxa" w:w="60"/>
+              <w:right w:type="dxa" w:w="100"/>
+            </w:tcMar>
+          </w:tcPr>
+          <w:p>
+            <w:pPr>
+              <w:spacing w:after="20"/>
+            </w:pPr>
+            <w:r>
+              <w:rPr>
+                <w:sz w:val="18"/>
+                <w:szCs w:val="18"/>
+              </w:rPr>
+              <w:t xml:space="preserve">Root cause, containment, corrective and preventive actions (simplified 8D); submit</w:t>
+            </w:r>
+          </w:p>
+        </w:tc>
+      </w:tr>
+      <w:tr>
+        <w:tc>
+          <w:tcPr>
+            <w:tcW w:type="dxa" w:w="1600"/>
+            <w:tcBorders>
+              <w:top w:val="single" w:color="D9DCE3" w:sz="4"/>
+              <w:left w:val="single" w:color="D9DCE3" w:sz="4"/>
+              <w:bottom w:val="single" w:color="D9DCE3" w:sz="4"/>
+              <w:right w:val="single" w:color="D9DCE3" w:sz="4"/>
+            </w:tcBorders>
+            <w:tcMar>
+              <w:top w:type="dxa" w:w="60"/>
+              <w:left w:type="dxa" w:w="100"/>
+              <w:bottom w:type="dxa" w:w="60"/>
+              <w:right w:type="dxa" w:w="100"/>
+            </w:tcMar>
+          </w:tcPr>
+          <w:p>
+            <w:pPr>
+              <w:spacing w:after="20"/>
+            </w:pPr>
+            <w:r>
+              <w:rPr>
+                <w:sz w:val="18"/>
+                <w:szCs w:val="18"/>
+              </w:rPr>
+              <w:t xml:space="preserve">Review</w:t>
+            </w:r>
+          </w:p>
+        </w:tc>
+        <w:tc>
+          <w:tcPr>
+            <w:tcW w:type="dxa" w:w="2800"/>
+            <w:tcBorders>
+              <w:top w:val="single" w:color="D9DCE3" w:sz="4"/>
+              <w:left w:val="single" w:color="D9DCE3" w:sz="4"/>
+              <w:bottom w:val="single" w:color="D9DCE3" w:sz="4"/>
+              <w:right w:val="single" w:color="D9DCE3" w:sz="4"/>
+            </w:tcBorders>
+            <w:tcMar>
+              <w:top w:type="dxa" w:w="60"/>
+              <w:left w:type="dxa" w:w="100"/>
+              <w:bottom w:type="dxa" w:w="60"/>
+              <w:right w:type="dxa" w:w="100"/>
+            </w:tcMar>
+          </w:tcPr>
+          <w:p>
+            <w:pPr>
+              <w:spacing w:after="20"/>
+            </w:pPr>
+            <w:r>
+              <w:rPr>
+                <w:sz w:val="18"/>
+                <w:szCs w:val="18"/>
+              </w:rPr>
+              <w:t xml:space="preserve">Fanatics</w:t>
+            </w:r>
+          </w:p>
+        </w:tc>
+        <w:tc>
+          <w:tcPr>
+            <w:tcW w:type="dxa" w:w="4960"/>
+            <w:tcBorders>
+              <w:top w:val="single" w:color="D9DCE3" w:sz="4"/>
+              <w:left w:val="single" w:color="D9DCE3" w:sz="4"/>
+              <w:bottom w:val="single" w:color="D9DCE3" w:sz="4"/>
+              <w:right w:val="single" w:color="D9DCE3" w:sz="4"/>
+            </w:tcBorders>
+            <w:tcMar>
+              <w:top w:type="dxa" w:w="60"/>
+              <w:left w:type="dxa" w:w="100"/>
+              <w:bottom w:type="dxa" w:w="60"/>
+              <w:right w:type="dxa" w:w="100"/>
+            </w:tcMar>
+          </w:tcPr>
+          <w:p>
+            <w:pPr>
+              <w:spacing w:after="20"/>
+            </w:pPr>
+            <w:r>
+              <w:rPr>
+                <w:sz w:val="18"/>
+                <w:szCs w:val="18"/>
+              </w:rPr>
+              <w:t xml:space="preserve">Accept, or return with notes (mill edits again)</w:t>
+            </w:r>
+          </w:p>
+        </w:tc>
+      </w:tr>
+      <w:tr>
+        <w:tc>
+          <w:tcPr>
+            <w:tcW w:type="dxa" w:w="1600"/>
+            <w:tcBorders>
+              <w:top w:val="single" w:color="D9DCE3" w:sz="4"/>
+              <w:left w:val="single" w:color="D9DCE3" w:sz="4"/>
+              <w:bottom w:val="single" w:color="D9DCE3" w:sz="4"/>
+              <w:right w:val="single" w:color="D9DCE3" w:sz="4"/>
+            </w:tcBorders>
+            <w:tcMar>
+              <w:top w:type="dxa" w:w="60"/>
+              <w:left w:type="dxa" w:w="100"/>
+              <w:bottom w:type="dxa" w:w="60"/>
+              <w:right w:type="dxa" w:w="100"/>
+            </w:tcMar>
+          </w:tcPr>
+          <w:p>
+            <w:pPr>
+              <w:spacing w:after="20"/>
+            </w:pPr>
+            <w:r>
+              <w:rPr>
+                <w:sz w:val="18"/>
+                <w:szCs w:val="18"/>
+              </w:rPr>
+              <w:t xml:space="preserve">Verify</w:t>
+            </w:r>
+          </w:p>
+        </w:tc>
+        <w:tc>
+          <w:tcPr>
+            <w:tcW w:type="dxa" w:w="2800"/>
+            <w:tcBorders>
+              <w:top w:val="single" w:color="D9DCE3" w:sz="4"/>
+              <w:left w:val="single" w:color="D9DCE3" w:sz="4"/>
+              <w:bottom w:val="single" w:color="D9DCE3" w:sz="4"/>
+              <w:right w:val="single" w:color="D9DCE3" w:sz="4"/>
+            </w:tcBorders>
+            <w:tcMar>
+              <w:top w:type="dxa" w:w="60"/>
+              <w:left w:type="dxa" w:w="100"/>
+              <w:bottom w:type="dxa" w:w="60"/>
+              <w:right w:type="dxa" w:w="100"/>
+            </w:tcMar>
+          </w:tcPr>
+          <w:p>
+            <w:pPr>
+              <w:spacing w:after="20"/>
+            </w:pPr>
+            <w:r>
+              <w:rPr>
+                <w:sz w:val="18"/>
+                <w:szCs w:val="18"/>
+              </w:rPr>
+              <w:t xml:space="preserve">Mill + Fanatics</w:t>
+            </w:r>
+          </w:p>
+        </w:tc>
+        <w:tc>
+          <w:tcPr>
+            <w:tcW w:type="dxa" w:w="4960"/>
+            <w:tcBorders>
+              <w:top w:val="single" w:color="D9DCE3" w:sz="4"/>
+              <w:left w:val="single" w:color="D9DCE3" w:sz="4"/>
+              <w:bottom w:val="single" w:color="D9DCE3" w:sz="4"/>
+              <w:right w:val="single" w:color="D9DCE3" w:sz="4"/>
+            </w:tcBorders>
+            <w:tcMar>
+              <w:top w:type="dxa" w:w="60"/>
+              <w:left w:type="dxa" w:w="100"/>
+              <w:bottom w:type="dxa" w:w="60"/>
+              <w:right w:type="dxa" w:w="100"/>
+            </w:tcMar>
+          </w:tcPr>
+          <w:p>
+            <w:pPr>
+              <w:spacing w:after="20"/>
+            </w:pPr>
+            <w:r>
+              <w:rPr>
+                <w:sz w:val="18"/>
+                <w:szCs w:val="18"/>
+              </w:rPr>
+              <w:t xml:space="preserve">Retest lot linked automatically; when approved, the CAPA closes automatically</w:t>
+            </w:r>
+          </w:p>
+        </w:tc>
+      </w:tr>
+    </w:tbl>
+    <w:p>
+      <w:pPr>
+        <w:spacing w:after="120" w:line="276"/>
+      </w:pPr>
+      <w:r>
+        <w:t xml:space="preserve">Database rule </w:t>
+      </w:r>
+      <w:r>
+        <w:rPr>
+          <w:rFonts w:ascii="Consolas" w:cs="Consolas" w:eastAsia="Consolas" w:hAnsi="Consolas"/>
+          <w:color w:val="09203F"/>
+          <w:sz w:val="18"/>
+          <w:szCs w:val="18"/>
+        </w:rPr>
+        <w:t xml:space="preserve">capa_supplier_guard</w:t>
+      </w:r>
+      <w:r>
+        <w:t xml:space="preserve">: suppliers can only edit their sections while the CAPA is open/returned and can only move it to submitted; they cannot change the problem, due date, review notes, links or close it. Overdue CAPAs are flagged on screen and in </w:t>
+      </w:r>
+      <w:r>
+        <w:rPr>
+          <w:rFonts w:ascii="Consolas" w:cs="Consolas" w:eastAsia="Consolas" w:hAnsi="Consolas"/>
+          <w:color w:val="09203F"/>
+          <w:sz w:val="18"/>
+          <w:szCs w:val="18"/>
+        </w:rPr>
+        <w:t xml:space="preserve">bi.capas</w:t>
+      </w:r>
+      <w:r>
+        <w:t xml:space="preserve">.</w:t>
+      </w:r>
+    </w:p>
+    <w:p>
+      <w:pPr>
         <w:pBdr>
           <w:left w:val="single" w:color="E8A317" w:sz="18" w:space="8"/>
         </w:pBdr>
@@ -10726,7 +11823,129 @@
         <w:pStyle w:val="Heading2"/>
       </w:pPr>
       <w:r>
-        <w:t xml:space="preserve">9.3 MCP server (AI agents)</w:t>
+        <w:t xml:space="preserve">9.3 Mobile app and push notifications</w:t>
+      </w:r>
+    </w:p>
+    <w:p>
+      <w:pPr>
+        <w:pStyle w:val="ListParagraph"/>
+        <w:numPr>
+          <w:ilvl w:val="0"/>
+          <w:numId w:val="3"/>
+        </w:numPr>
+        <w:spacing w:after="60" w:line="264"/>
+      </w:pPr>
+      <w:r>
+        <w:t xml:space="preserve">The portal is an installable </w:t>
+      </w:r>
+      <w:r>
+        <w:rPr>
+          <w:b/>
+          <w:bCs/>
+        </w:rPr>
+        <w:t xml:space="preserve">Progressive Web App</w:t>
+      </w:r>
+      <w:r>
+        <w:t xml:space="preserve"> (Android, iOS 16.4+, Windows/macOS) with its own icon, full-screen mode and an offline page. Authenticated pages are never cached on the device.</w:t>
+      </w:r>
+    </w:p>
+    <w:p>
+      <w:pPr>
+        <w:pStyle w:val="ListParagraph"/>
+        <w:numPr>
+          <w:ilvl w:val="0"/>
+          <w:numId w:val="3"/>
+        </w:numPr>
+        <w:spacing w:after="60" w:line="264"/>
+      </w:pPr>
+      <w:r>
+        <w:rPr>
+          <w:b/>
+          <w:bCs/>
+        </w:rPr>
+        <w:t xml:space="preserve">Web Push</w:t>
+      </w:r>
+      <w:r>
+        <w:t xml:space="preserve"> uses the VAPID standard (</w:t>
+      </w:r>
+      <w:r>
+        <w:rPr>
+          <w:rFonts w:ascii="Consolas" w:cs="Consolas" w:eastAsia="Consolas" w:hAnsi="Consolas"/>
+          <w:color w:val="09203F"/>
+          <w:sz w:val="18"/>
+          <w:szCs w:val="18"/>
+        </w:rPr>
+        <w:t xml:space="preserve">web-push</w:t>
+      </w:r>
+      <w:r>
+        <w:t xml:space="preserve"> library). Each device subscription (endpoint + public keys) is stored per user under RLS; payloads contain only a title, short text and an in-app link — no test data. Expired subscriptions are removed automatically. Keys: </w:t>
+      </w:r>
+      <w:r>
+        <w:rPr>
+          <w:rFonts w:ascii="Consolas" w:cs="Consolas" w:eastAsia="Consolas" w:hAnsi="Consolas"/>
+          <w:color w:val="09203F"/>
+          <w:sz w:val="18"/>
+          <w:szCs w:val="18"/>
+        </w:rPr>
+        <w:t xml:space="preserve">NEXT_PUBLIC_VAPID_PUBLIC_KEY</w:t>
+      </w:r>
+      <w:r>
+        <w:t xml:space="preserve">, </w:t>
+      </w:r>
+      <w:r>
+        <w:rPr>
+          <w:rFonts w:ascii="Consolas" w:cs="Consolas" w:eastAsia="Consolas" w:hAnsi="Consolas"/>
+          <w:color w:val="09203F"/>
+          <w:sz w:val="18"/>
+          <w:szCs w:val="18"/>
+        </w:rPr>
+        <w:t xml:space="preserve">VAPID_PRIVATE_KEY</w:t>
+      </w:r>
+      <w:r>
+        <w:t xml:space="preserve"> (server only).</w:t>
+      </w:r>
+    </w:p>
+    <w:p>
+      <w:pPr>
+        <w:pStyle w:val="ListParagraph"/>
+        <w:numPr>
+          <w:ilvl w:val="0"/>
+          <w:numId w:val="3"/>
+        </w:numPr>
+        <w:spacing w:after="60" w:line="264"/>
+      </w:pPr>
+      <w:r>
+        <w:t xml:space="preserve">A </w:t>
+      </w:r>
+      <w:r>
+        <w:rPr>
+          <w:b/>
+          <w:bCs/>
+        </w:rPr>
+        <w:t xml:space="preserve">Capacitor</w:t>
+      </w:r>
+      <w:r>
+        <w:t xml:space="preserve"> wrapper (</w:t>
+      </w:r>
+      <w:r>
+        <w:rPr>
+          <w:rFonts w:ascii="Consolas" w:cs="Consolas" w:eastAsia="Consolas" w:hAnsi="Consolas"/>
+          <w:color w:val="09203F"/>
+          <w:sz w:val="18"/>
+          <w:szCs w:val="18"/>
+        </w:rPr>
+        <w:t xml:space="preserve">mobile/</w:t>
+      </w:r>
+      <w:r>
+        <w:t xml:space="preserve">) packages the hosted site for Google Play / App Store if required; native push would use FCM / APNs.</w:t>
+      </w:r>
+    </w:p>
+    <w:p>
+      <w:pPr>
+        <w:pStyle w:val="Heading2"/>
+      </w:pPr>
+      <w:r>
+        <w:t xml:space="preserve">9.4 MCP server (AI agents)</w:t>
       </w:r>
     </w:p>
     <w:p>
@@ -10991,7 +12210,7 @@
                 <w:sz w:val="18"/>
                 <w:szCs w:val="18"/>
               </w:rPr>
-              <w:t xml:space="preserve">Unit tests (13)</w:t>
+              <w:t xml:space="preserve">Unit tests (17)</w:t>
             </w:r>
           </w:p>
         </w:tc>
@@ -11020,7 +12239,7 @@
                 <w:sz w:val="18"/>
                 <w:szCs w:val="18"/>
               </w:rPr>
-              <w:t xml:space="preserve">ΔE conversion, heat ladder, method verdicts, fiber-specific minimums, overrides, per-color worst case, critical failures, CSV injection, password policy</w:t>
+              <w:t xml:space="preserve">ΔE conversion, heat ladder, method verdicts, fiber-specific minimums, overrides, per-color worst case, critical failures, garment-trial rules, CAPA state machine and overdue logic, CSV injection, password policy</w:t>
             </w:r>
           </w:p>
         </w:tc>
@@ -11049,7 +12268,7 @@
                 <w:sz w:val="18"/>
                 <w:szCs w:val="18"/>
               </w:rPr>
-              <w:t xml:space="preserve">13/13 pass</w:t>
+              <w:t xml:space="preserve">17/17 pass</w:t>
             </w:r>
           </w:p>
         </w:tc>
@@ -11109,7 +12328,7 @@
                 <w:sz w:val="18"/>
                 <w:szCs w:val="18"/>
               </w:rPr>
-              <w:t xml:space="preserve">On PostgreSQL 16: supplier A cannot read, insert or upload into supplier B; cannot approve its own lot; audit log cannot be modified even by the owner; audit chain verifies; schema re-runnable</w:t>
+              <w:t xml:space="preserve">On PostgreSQL 16: supplier A cannot read, insert or upload into supplier B; cannot approve its own lot; cannot open, close or alter Fanatics fields of a CAPA, nor edit it after submitting; cannot see other users' push subscriptions; audit log immutable; audit chain verifies; schema re-runnable</w:t>
             </w:r>
           </w:p>
         </w:tc>
@@ -11198,7 +12417,7 @@
                 <w:sz w:val="18"/>
                 <w:szCs w:val="18"/>
               </w:rPr>
-              <w:t xml:space="preserve">Supplier creates lot with colors, adds results with photo; supplier isolation (404 / 403 / redirects); admin decision; notifications; API key valid → 200, invalid → 401; Spanish UI; demo/real toggle</w:t>
+              <w:t xml:space="preserve">Supplier creates lot with colors, adds results with photo; supplier isolation (404 / 403 / redirects); admin decision; notifications; API key valid → 200, invalid → 401; Spanish UI; demo/real toggle; garment trial with before/after photos → rejection → automatic CAPA → mill submits → Fanatics accepts → retest linked → retest approved → CAPA closed; service worker, manifest and offline page</w:t>
             </w:r>
           </w:p>
         </w:tc>
@@ -11890,6 +13109,66 @@
                 <w:szCs w:val="18"/>
               </w:rPr>
               <w:t xml:space="preserve">false = hide the demo sandbox in production</w:t>
+            </w:r>
+          </w:p>
+        </w:tc>
+      </w:tr>
+      <w:tr>
+        <w:tc>
+          <w:tcPr>
+            <w:tcW w:type="dxa" w:w="4300"/>
+            <w:tcBorders>
+              <w:top w:val="single" w:color="D9DCE3" w:sz="4"/>
+              <w:left w:val="single" w:color="D9DCE3" w:sz="4"/>
+              <w:bottom w:val="single" w:color="D9DCE3" w:sz="4"/>
+              <w:right w:val="single" w:color="D9DCE3" w:sz="4"/>
+            </w:tcBorders>
+            <w:tcMar>
+              <w:top w:type="dxa" w:w="60"/>
+              <w:left w:type="dxa" w:w="100"/>
+              <w:bottom w:type="dxa" w:w="60"/>
+              <w:right w:type="dxa" w:w="100"/>
+            </w:tcMar>
+          </w:tcPr>
+          <w:p>
+            <w:pPr>
+              <w:spacing w:after="20"/>
+            </w:pPr>
+            <w:r>
+              <w:rPr>
+                <w:sz w:val="18"/>
+                <w:szCs w:val="18"/>
+              </w:rPr>
+              <w:t xml:space="preserve">NEXT_PUBLIC_VAPID_PUBLIC_KEY / VAPID_PRIVATE_KEY / VAPID_SUBJECT</w:t>
+            </w:r>
+          </w:p>
+        </w:tc>
+        <w:tc>
+          <w:tcPr>
+            <w:tcW w:type="dxa" w:w="5060"/>
+            <w:tcBorders>
+              <w:top w:val="single" w:color="D9DCE3" w:sz="4"/>
+              <w:left w:val="single" w:color="D9DCE3" w:sz="4"/>
+              <w:bottom w:val="single" w:color="D9DCE3" w:sz="4"/>
+              <w:right w:val="single" w:color="D9DCE3" w:sz="4"/>
+            </w:tcBorders>
+            <w:tcMar>
+              <w:top w:type="dxa" w:w="60"/>
+              <w:left w:type="dxa" w:w="100"/>
+              <w:bottom w:type="dxa" w:w="60"/>
+              <w:right w:type="dxa" w:w="100"/>
+            </w:tcMar>
+          </w:tcPr>
+          <w:p>
+            <w:pPr>
+              <w:spacing w:after="20"/>
+            </w:pPr>
+            <w:r>
+              <w:rPr>
+                <w:sz w:val="18"/>
+                <w:szCs w:val="18"/>
+              </w:rPr>
+              <w:t xml:space="preserve">Web push notifications (private key is server-only)</w:t>
             </w:r>
           </w:p>
         </w:tc>
@@ -13930,33 +15209,7 @@
         <w:spacing w:after="60" w:line="264"/>
       </w:pPr>
       <w:r>
-        <w:t xml:space="preserve">Finished-garment testing with before/after wash photos.</w:t>
-      </w:r>
-    </w:p>
-    <w:p>
-      <w:pPr>
-        <w:pStyle w:val="ListParagraph"/>
-        <w:numPr>
-          <w:ilvl w:val="0"/>
-          <w:numId w:val="3"/>
-        </w:numPr>
-        <w:spacing w:after="60" w:line="264"/>
-      </w:pPr>
-      <w:r>
-        <w:t xml:space="preserve">Corrective-action (CAPA) workflow for rejected lots.</w:t>
-      </w:r>
-    </w:p>
-    <w:p>
-      <w:pPr>
-        <w:pStyle w:val="ListParagraph"/>
-        <w:numPr>
-          <w:ilvl w:val="0"/>
-          <w:numId w:val="3"/>
-        </w:numPr>
-        <w:spacing w:after="60" w:line="264"/>
-      </w:pPr>
-      <w:r>
-        <w:t xml:space="preserve">Web push notifications and mobile app wrapper.</w:t>
+        <w:t xml:space="preserve">Native push for store builds (Firebase Cloud Messaging / APNs).</w:t>
       </w:r>
     </w:p>
     <w:p>
@@ -14470,6 +15723,66 @@
                 <w:szCs w:val="18"/>
               </w:rPr>
               <w:t xml:space="preserve">Read-only MCP server</w:t>
+            </w:r>
+          </w:p>
+        </w:tc>
+      </w:tr>
+      <w:tr>
+        <w:tc>
+          <w:tcPr>
+            <w:tcW w:type="dxa" w:w="2400"/>
+            <w:tcBorders>
+              <w:top w:val="single" w:color="D9DCE3" w:sz="4"/>
+              <w:left w:val="single" w:color="D9DCE3" w:sz="4"/>
+              <w:bottom w:val="single" w:color="D9DCE3" w:sz="4"/>
+              <w:right w:val="single" w:color="D9DCE3" w:sz="4"/>
+            </w:tcBorders>
+            <w:tcMar>
+              <w:top w:type="dxa" w:w="60"/>
+              <w:left w:type="dxa" w:w="100"/>
+              <w:bottom w:type="dxa" w:w="60"/>
+              <w:right w:type="dxa" w:w="100"/>
+            </w:tcMar>
+          </w:tcPr>
+          <w:p>
+            <w:pPr>
+              <w:spacing w:after="20"/>
+            </w:pPr>
+            <w:r>
+              <w:rPr>
+                <w:sz w:val="18"/>
+                <w:szCs w:val="18"/>
+              </w:rPr>
+              <w:t xml:space="preserve">mobile/</w:t>
+            </w:r>
+          </w:p>
+        </w:tc>
+        <w:tc>
+          <w:tcPr>
+            <w:tcW w:type="dxa" w:w="6960"/>
+            <w:tcBorders>
+              <w:top w:val="single" w:color="D9DCE3" w:sz="4"/>
+              <w:left w:val="single" w:color="D9DCE3" w:sz="4"/>
+              <w:bottom w:val="single" w:color="D9DCE3" w:sz="4"/>
+              <w:right w:val="single" w:color="D9DCE3" w:sz="4"/>
+            </w:tcBorders>
+            <w:tcMar>
+              <w:top w:type="dxa" w:w="60"/>
+              <w:left w:type="dxa" w:w="100"/>
+              <w:bottom w:type="dxa" w:w="60"/>
+              <w:right w:type="dxa" w:w="100"/>
+            </w:tcMar>
+          </w:tcPr>
+          <w:p>
+            <w:pPr>
+              <w:spacing w:after="20"/>
+            </w:pPr>
+            <w:r>
+              <w:rPr>
+                <w:sz w:val="18"/>
+                <w:szCs w:val="18"/>
+              </w:rPr>
+              <w:t xml:space="preserve">Capacitor wrapper for Android / iOS store builds</w:t>
             </w:r>
           </w:p>
         </w:tc>
@@ -14665,7 +15978,7 @@
         <w:sz w:val="16"/>
         <w:szCs w:val="16"/>
       </w:rPr>
-      <w:t xml:space="preserve">Owner: Digna Julia Herrera · v1.0</w:t>
+      <w:t xml:space="preserve">Owner: Digna Julia Herrera · v1.1</w:t>
     </w:r>
     <w:r>
       <w:rPr>

</xml_diff>